<commit_message>
Fix vanished list bullets under the HLD reference doc; wire up gantry new
pandoc's tight-list "Compact" style (and 16 other auxiliary styles) was
never defined in the raw HLD template used as --reference-doc, and an
undefined w:pStyle silently suppresses a paragraph's direct-formatted
list numbering in LibreOffice/Word. build-reference-doc.py merges those
missing styles in from pandoc's own default reference doc, keeping the
HLD's fonts/headings/margins as the base.

Also wires `gantry new` to the existing createInstance() (a leftover
stub), and adds two end-to-end demo instances proving the golden path
both ways: demo-cli (hand-authored files) and demo-web (authored via
the web form's actual save API).
</commit_message>
<xml_diff>
--- a/definitions/design/templates/reference.docx
+++ b/definitions/design/templates/reference.docx
@@ -23054,6 +23054,172 @@
       <w:lang w:eastAsia="en-NZ"/>
     </w:rPr>
   </w:style>
+  <w:style xmlns:w="http://schemas.openxmlformats.org/wordprocessingml/2006/main" w:type="paragraph" w:customStyle="1" w:styleId="FirstParagraph">
+    <w:name w:val="First Paragraph"/>
+    <w:basedOn w:val="BodyText"/>
+    <w:next w:val="BodyText"/>
+    <w:qFormat/>
+  </w:style>
+  <w:style xmlns:w="http://schemas.openxmlformats.org/wordprocessingml/2006/main" w:type="paragraph" w:customStyle="1" w:styleId="Compact">
+    <w:name w:val="Compact"/>
+    <w:basedOn w:val="BodyText"/>
+    <w:qFormat/>
+    <w:pPr>
+      <w:spacing w:before="36" w:after="36"/>
+    </w:pPr>
+  </w:style>
+  <w:style xmlns:w="http://schemas.openxmlformats.org/wordprocessingml/2006/main" w:type="paragraph" w:customStyle="1" w:styleId="Author">
+    <w:name w:val="Author"/>
+    <w:next w:val="BodyText"/>
+    <w:qFormat/>
+    <w:pPr>
+      <w:keepNext/>
+      <w:keepLines/>
+      <w:jc w:val="center"/>
+    </w:pPr>
+  </w:style>
+  <w:style xmlns:w="http://schemas.openxmlformats.org/wordprocessingml/2006/main" w:type="paragraph" w:customStyle="1" w:styleId="AbstractTitle">
+    <w:name w:val="Abstract Title"/>
+    <w:basedOn w:val="Normal"/>
+    <w:next w:val="Abstract"/>
+    <w:qFormat/>
+    <w:pPr>
+      <w:keepNext/>
+      <w:keepLines/>
+      <w:jc w:val="center"/>
+      <w:spacing w:before="300" w:after="0"/>
+    </w:pPr>
+    <w:rPr>
+      <w:sz w:val="20"/>
+      <w:szCs w:val="20"/>
+      <w:b/>
+      <w:color w:val="345A8A"/>
+      &gt;
+    </w:rPr>
+  </w:style>
+  <w:style xmlns:w="http://schemas.openxmlformats.org/wordprocessingml/2006/main" w:type="paragraph" w:customStyle="1" w:styleId="Abstract">
+    <w:name w:val="Abstract"/>
+    <w:basedOn w:val="Normal"/>
+    <w:next w:val="BodyText"/>
+    <w:qFormat/>
+    <w:pPr>
+      <w:keepNext/>
+      <w:keepLines/>
+      <w:spacing w:before="100" w:after="300"/>
+    </w:pPr>
+    <w:rPr>
+      <w:sz w:val="20"/>
+      <w:szCs w:val="20"/>
+    </w:rPr>
+  </w:style>
+  <w:style xmlns:w="http://schemas.openxmlformats.org/wordprocessingml/2006/main" w:type="paragraph" w:styleId="Bibliography">
+    <w:name w:val="Bibliography"/>
+    <w:basedOn w:val="Normal"/>
+    <w:next w:val="Bibliography"/>
+    <w:qFormat/>
+    <w:pPr/>
+    <w:rPr/>
+  </w:style>
+  <w:style xmlns:w="http://schemas.openxmlformats.org/wordprocessingml/2006/main" w:type="table" w:default="1" w:styleId="Table">
+    <w:name w:val="Table"/>
+    <w:basedOn w:val="TableNormal"/>
+    <w:semiHidden/>
+    <w:unhideWhenUsed/>
+    <w:qFormat/>
+    <w:tblPr>
+      <w:tblInd w:w="0" w:type="dxa"/>
+      <w:tblCellMar>
+        <w:top w:w="0" w:type="dxa"/>
+        <w:left w:w="108" w:type="dxa"/>
+        <w:bottom w:w="0" w:type="dxa"/>
+        <w:right w:w="108" w:type="dxa"/>
+      </w:tblCellMar>
+    </w:tblPr>
+    <w:tblStylePr w:type="firstRow">
+      <w:tblPr>
+        <w:jc w:val="left"/>
+        <w:tblInd w:w="0" w:type="dxa"/>
+      </w:tblPr>
+      <w:trPr>
+        <w:jc w:val="left"/>
+      </w:trPr>
+      <w:tcPr>
+        <w:vAlign w:val="bottom"/>
+        <w:tcBorders>
+          <w:bottom w:val="single"/>
+        </w:tcBorders>
+      </w:tcPr>
+    </w:tblStylePr>
+  </w:style>
+  <w:style xmlns:w="http://schemas.openxmlformats.org/wordprocessingml/2006/main" w:type="paragraph" w:customStyle="1" w:styleId="DefinitionTerm">
+    <w:name w:val="Definition Term"/>
+    <w:basedOn w:val="Normal"/>
+    <w:next w:val="Definition"/>
+    <w:pPr>
+      <w:keepNext/>
+      <w:keepLines/>
+      <w:spacing w:after="0"/>
+    </w:pPr>
+    <w:rPr>
+      <w:b/>
+    </w:rPr>
+  </w:style>
+  <w:style xmlns:w="http://schemas.openxmlformats.org/wordprocessingml/2006/main" w:type="paragraph" w:customStyle="1" w:styleId="Definition">
+    <w:name w:val="Definition"/>
+    <w:basedOn w:val="Normal"/>
+  </w:style>
+  <w:style xmlns:w="http://schemas.openxmlformats.org/wordprocessingml/2006/main" w:type="paragraph" w:styleId="Caption">
+    <w:name w:val="Caption"/>
+    <w:basedOn w:val="Normal"/>
+    <w:link w:val="BodyTextChar"/>
+    <w:pPr>
+      <w:spacing w:before="0" w:after="120"/>
+    </w:pPr>
+    <w:rPr>
+      <w:i/>
+    </w:rPr>
+  </w:style>
+  <w:style xmlns:w="http://schemas.openxmlformats.org/wordprocessingml/2006/main" w:type="paragraph" w:customStyle="1" w:styleId="TableCaption">
+    <w:name w:val="Table Caption"/>
+    <w:basedOn w:val="Caption"/>
+    <w:pPr>
+      <w:keepNext/>
+    </w:pPr>
+  </w:style>
+  <w:style xmlns:w="http://schemas.openxmlformats.org/wordprocessingml/2006/main" w:type="paragraph" w:customStyle="1" w:styleId="ImageCaption">
+    <w:name w:val="Image Caption"/>
+    <w:basedOn w:val="Caption"/>
+  </w:style>
+  <w:style xmlns:w="http://schemas.openxmlformats.org/wordprocessingml/2006/main" w:type="paragraph" w:customStyle="1" w:styleId="Figure">
+    <w:name w:val="Figure"/>
+    <w:basedOn w:val="Normal"/>
+  </w:style>
+  <w:style xmlns:w="http://schemas.openxmlformats.org/wordprocessingml/2006/main" w:type="paragraph" w:customStyle="1" w:styleId="CaptionedFigure">
+    <w:name w:val="Captioned Figure"/>
+    <w:basedOn w:val="Figure"/>
+    <w:pPr>
+      <w:keepNext/>
+    </w:pPr>
+  </w:style>
+  <w:style xmlns:w="http://schemas.openxmlformats.org/wordprocessingml/2006/main" w:type="character" w:customStyle="1" w:styleId="VerbatimChar">
+    <w:name w:val="Verbatim Char"/>
+    <w:basedOn w:val="BodyTextChar"/>
+    <w:rPr>
+      <w:rFonts w:ascii="Consolas" w:hAnsi="Consolas"/>
+      <w:sz w:val="22"/>
+    </w:rPr>
+  </w:style>
+  <w:style xmlns:w="http://schemas.openxmlformats.org/wordprocessingml/2006/main" w:type="character" w:customStyle="1" w:styleId="SectionNumber">
+    <w:name w:val="Section Number"/>
+    <w:basedOn w:val="BodyTextChar"/>
+  </w:style>
+  <w:style xmlns:w="http://schemas.openxmlformats.org/wordprocessingml/2006/main" w:type="character" w:styleId="FootnoteReference">
+    <w:name w:val="Footnote Reference"/>
+    <w:basedOn w:val="BodyTextChar"/>
+    <w:rPr>
+      <w:vertAlign w:val="superscript"/>
+    </w:rPr>
+  </w:style>
 </w:styles>
 </file>
 

</xml_diff>